<commit_message>
docs: rigenera PDF e Word con la correzione del catalogo libri
Co-Authored-By: Claude Sonnet 5.5 <noreply@anthropic.com>
Claude-Session: https://claude.ai/code/session_01DPUBhn6Kdf7URgPzZNjJaf
</commit_message>
<xml_diff>
--- a/deliverables/BiblioFlow-CR-BF-01-consegna-2026-10-13/documenti/01 - Report finale CR-BF-01.docx
+++ b/deliverables/BiblioFlow-CR-BF-01-consegna-2026-10-13/documenti/01 - Report finale CR-BF-01.docx
@@ -86,7 +86,7 @@
         <w:rPr>
           <w:rStyle w:val="VerbatimChar"/>
         </w:rPr>
-        <w:t>066f198</w:t>
+        <w:t>20efb4b</w:t>
       </w:r>
     </w:p>
     <w:p>
@@ -156,7 +156,7 @@
             </w:rPr>
             <w:fldChar w:fldCharType="separate"/>
           </w:r>
-          <w:hyperlink w:anchor="__RefHeading___Toc7552_3672760668">
+          <w:hyperlink w:anchor="__RefHeading___Toc7603_4122350189">
             <w:r>
               <w:rPr>
                 <w:webHidden/>
@@ -177,7 +177,7 @@
             </w:tabs>
             <w:rPr/>
           </w:pPr>
-          <w:hyperlink w:anchor="__RefHeading___Toc7554_3672760668">
+          <w:hyperlink w:anchor="__RefHeading___Toc7605_4122350189">
             <w:r>
               <w:rPr>
                 <w:webHidden/>
@@ -198,7 +198,7 @@
             </w:tabs>
             <w:rPr/>
           </w:pPr>
-          <w:hyperlink w:anchor="__RefHeading___Toc7556_3672760668">
+          <w:hyperlink w:anchor="__RefHeading___Toc7607_4122350189">
             <w:r>
               <w:rPr>
                 <w:webHidden/>
@@ -219,7 +219,7 @@
             </w:tabs>
             <w:rPr/>
           </w:pPr>
-          <w:hyperlink w:anchor="__RefHeading___Toc7558_3672760668">
+          <w:hyperlink w:anchor="__RefHeading___Toc7609_4122350189">
             <w:r>
               <w:rPr>
                 <w:webHidden/>
@@ -240,7 +240,7 @@
             </w:tabs>
             <w:rPr/>
           </w:pPr>
-          <w:hyperlink w:anchor="__RefHeading___Toc7560_3672760668">
+          <w:hyperlink w:anchor="__RefHeading___Toc7611_4122350189">
             <w:r>
               <w:rPr>
                 <w:webHidden/>
@@ -261,7 +261,7 @@
             </w:tabs>
             <w:rPr/>
           </w:pPr>
-          <w:hyperlink w:anchor="__RefHeading___Toc7562_3672760668">
+          <w:hyperlink w:anchor="__RefHeading___Toc7613_4122350189">
             <w:r>
               <w:rPr>
                 <w:webHidden/>
@@ -282,7 +282,7 @@
             </w:tabs>
             <w:rPr/>
           </w:pPr>
-          <w:hyperlink w:anchor="__RefHeading___Toc7564_3672760668">
+          <w:hyperlink w:anchor="__RefHeading___Toc7615_4122350189">
             <w:r>
               <w:rPr>
                 <w:webHidden/>
@@ -303,7 +303,7 @@
             </w:tabs>
             <w:rPr/>
           </w:pPr>
-          <w:hyperlink w:anchor="__RefHeading___Toc7566_3672760668">
+          <w:hyperlink w:anchor="__RefHeading___Toc7617_4122350189">
             <w:r>
               <w:rPr>
                 <w:webHidden/>
@@ -324,7 +324,7 @@
             </w:tabs>
             <w:rPr/>
           </w:pPr>
-          <w:hyperlink w:anchor="__RefHeading___Toc7568_3672760668">
+          <w:hyperlink w:anchor="__RefHeading___Toc7619_4122350189">
             <w:r>
               <w:rPr>
                 <w:webHidden/>
@@ -345,7 +345,7 @@
             </w:tabs>
             <w:rPr/>
           </w:pPr>
-          <w:hyperlink w:anchor="__RefHeading___Toc7570_3672760668">
+          <w:hyperlink w:anchor="__RefHeading___Toc7621_4122350189">
             <w:r>
               <w:rPr>
                 <w:webHidden/>
@@ -366,7 +366,7 @@
             </w:tabs>
             <w:rPr/>
           </w:pPr>
-          <w:hyperlink w:anchor="__RefHeading___Toc7572_3672760668">
+          <w:hyperlink w:anchor="__RefHeading___Toc7623_4122350189">
             <w:r>
               <w:rPr>
                 <w:webHidden/>
@@ -387,7 +387,7 @@
             </w:tabs>
             <w:rPr/>
           </w:pPr>
-          <w:hyperlink w:anchor="__RefHeading___Toc7574_3672760668">
+          <w:hyperlink w:anchor="__RefHeading___Toc7625_4122350189">
             <w:r>
               <w:rPr>
                 <w:webHidden/>
@@ -408,7 +408,7 @@
             </w:tabs>
             <w:rPr/>
           </w:pPr>
-          <w:hyperlink w:anchor="__RefHeading___Toc7576_3672760668">
+          <w:hyperlink w:anchor="__RefHeading___Toc7627_4122350189">
             <w:r>
               <w:rPr>
                 <w:webHidden/>
@@ -429,7 +429,7 @@
             </w:tabs>
             <w:rPr/>
           </w:pPr>
-          <w:hyperlink w:anchor="__RefHeading___Toc7578_3672760668">
+          <w:hyperlink w:anchor="__RefHeading___Toc7629_4122350189">
             <w:r>
               <w:rPr>
                 <w:webHidden/>
@@ -450,7 +450,7 @@
             </w:tabs>
             <w:rPr/>
           </w:pPr>
-          <w:hyperlink w:anchor="__RefHeading___Toc7580_3672760668">
+          <w:hyperlink w:anchor="__RefHeading___Toc7631_4122350189">
             <w:r>
               <w:rPr>
                 <w:webHidden/>
@@ -471,7 +471,7 @@
             </w:tabs>
             <w:rPr/>
           </w:pPr>
-          <w:hyperlink w:anchor="__RefHeading___Toc7582_3672760668">
+          <w:hyperlink w:anchor="__RefHeading___Toc7633_4122350189">
             <w:r>
               <w:rPr>
                 <w:webHidden/>
@@ -492,7 +492,7 @@
             </w:tabs>
             <w:rPr/>
           </w:pPr>
-          <w:hyperlink w:anchor="__RefHeading___Toc7584_3672760668">
+          <w:hyperlink w:anchor="__RefHeading___Toc7635_4122350189">
             <w:r>
               <w:rPr>
                 <w:webHidden/>
@@ -513,7 +513,7 @@
             </w:tabs>
             <w:rPr/>
           </w:pPr>
-          <w:hyperlink w:anchor="__RefHeading___Toc7586_3672760668">
+          <w:hyperlink w:anchor="__RefHeading___Toc7637_4122350189">
             <w:r>
               <w:rPr>
                 <w:webHidden/>
@@ -534,7 +534,7 @@
             </w:tabs>
             <w:rPr/>
           </w:pPr>
-          <w:hyperlink w:anchor="__RefHeading___Toc7588_3672760668">
+          <w:hyperlink w:anchor="__RefHeading___Toc7639_4122350189">
             <w:r>
               <w:rPr>
                 <w:webHidden/>
@@ -555,7 +555,7 @@
             </w:tabs>
             <w:rPr/>
           </w:pPr>
-          <w:hyperlink w:anchor="__RefHeading___Toc7590_3672760668">
+          <w:hyperlink w:anchor="__RefHeading___Toc7641_4122350189">
             <w:r>
               <w:rPr>
                 <w:webHidden/>
@@ -576,7 +576,7 @@
             </w:tabs>
             <w:rPr/>
           </w:pPr>
-          <w:hyperlink w:anchor="__RefHeading___Toc7592_3672760668">
+          <w:hyperlink w:anchor="__RefHeading___Toc7643_4122350189">
             <w:r>
               <w:rPr>
                 <w:webHidden/>
@@ -597,7 +597,7 @@
             </w:tabs>
             <w:rPr/>
           </w:pPr>
-          <w:hyperlink w:anchor="__RefHeading___Toc7594_3672760668">
+          <w:hyperlink w:anchor="__RefHeading___Toc7645_4122350189">
             <w:r>
               <w:rPr>
                 <w:webHidden/>
@@ -618,7 +618,7 @@
             </w:tabs>
             <w:rPr/>
           </w:pPr>
-          <w:hyperlink w:anchor="__RefHeading___Toc7596_3672760668">
+          <w:hyperlink w:anchor="__RefHeading___Toc7647_4122350189">
             <w:r>
               <w:rPr>
                 <w:webHidden/>
@@ -639,7 +639,7 @@
             </w:tabs>
             <w:rPr/>
           </w:pPr>
-          <w:hyperlink w:anchor="__RefHeading___Toc7598_3672760668">
+          <w:hyperlink w:anchor="__RefHeading___Toc7649_4122350189">
             <w:r>
               <w:rPr>
                 <w:webHidden/>
@@ -660,7 +660,7 @@
             </w:tabs>
             <w:rPr/>
           </w:pPr>
-          <w:hyperlink w:anchor="__RefHeading___Toc7600_3672760668">
+          <w:hyperlink w:anchor="__RefHeading___Toc7651_4122350189">
             <w:r>
               <w:rPr>
                 <w:webHidden/>
@@ -681,7 +681,7 @@
             </w:tabs>
             <w:rPr/>
           </w:pPr>
-          <w:hyperlink w:anchor="__RefHeading___Toc7602_3672760668">
+          <w:hyperlink w:anchor="__RefHeading___Toc7653_4122350189">
             <w:r>
               <w:rPr>
                 <w:webHidden/>
@@ -702,7 +702,7 @@
             </w:tabs>
             <w:rPr/>
           </w:pPr>
-          <w:hyperlink w:anchor="__RefHeading___Toc7604_3672760668">
+          <w:hyperlink w:anchor="__RefHeading___Toc7655_4122350189">
             <w:r>
               <w:rPr>
                 <w:webHidden/>
@@ -723,7 +723,7 @@
             </w:tabs>
             <w:rPr/>
           </w:pPr>
-          <w:hyperlink w:anchor="__RefHeading___Toc7606_3672760668">
+          <w:hyperlink w:anchor="__RefHeading___Toc7657_4122350189">
             <w:r>
               <w:rPr>
                 <w:webHidden/>
@@ -744,7 +744,7 @@
             </w:tabs>
             <w:rPr/>
           </w:pPr>
-          <w:hyperlink w:anchor="__RefHeading___Toc7608_3672760668">
+          <w:hyperlink w:anchor="__RefHeading___Toc7659_4122350189">
             <w:r>
               <w:rPr>
                 <w:webHidden/>
@@ -765,7 +765,7 @@
             </w:tabs>
             <w:rPr/>
           </w:pPr>
-          <w:hyperlink w:anchor="__RefHeading___Toc7610_3672760668">
+          <w:hyperlink w:anchor="__RefHeading___Toc7661_4122350189">
             <w:r>
               <w:rPr>
                 <w:webHidden/>
@@ -786,7 +786,7 @@
             </w:tabs>
             <w:rPr/>
           </w:pPr>
-          <w:hyperlink w:anchor="__RefHeading___Toc7612_3672760668">
+          <w:hyperlink w:anchor="__RefHeading___Toc7663_4122350189">
             <w:r>
               <w:rPr>
                 <w:webHidden/>
@@ -807,7 +807,7 @@
             </w:tabs>
             <w:rPr/>
           </w:pPr>
-          <w:hyperlink w:anchor="__RefHeading___Toc7614_3672760668">
+          <w:hyperlink w:anchor="__RefHeading___Toc7665_4122350189">
             <w:r>
               <w:rPr>
                 <w:webHidden/>
@@ -828,7 +828,7 @@
             </w:tabs>
             <w:rPr/>
           </w:pPr>
-          <w:hyperlink w:anchor="__RefHeading___Toc7616_3672760668">
+          <w:hyperlink w:anchor="__RefHeading___Toc7667_4122350189">
             <w:r>
               <w:rPr>
                 <w:webHidden/>
@@ -849,7 +849,7 @@
             </w:tabs>
             <w:rPr/>
           </w:pPr>
-          <w:hyperlink w:anchor="__RefHeading___Toc7618_3672760668">
+          <w:hyperlink w:anchor="__RefHeading___Toc7669_4122350189">
             <w:r>
               <w:rPr>
                 <w:webHidden/>
@@ -897,7 +897,7 @@
         <w:spacing w:before="0" w:after="120"/>
         <w:rPr/>
       </w:pPr>
-      <w:bookmarkStart w:id="0" w:name="__RefHeading___Toc7552_3672760668"/>
+      <w:bookmarkStart w:id="0" w:name="__RefHeading___Toc7603_4122350189"/>
       <w:bookmarkEnd w:id="0"/>
       <w:r>
         <w:rPr/>
@@ -1560,7 +1560,7 @@
         <w:pStyle w:val="Heading1"/>
         <w:rPr/>
       </w:pPr>
-      <w:bookmarkStart w:id="2" w:name="__RefHeading___Toc7554_3672760668"/>
+      <w:bookmarkStart w:id="2" w:name="__RefHeading___Toc7605_4122350189"/>
       <w:bookmarkEnd w:id="2"/>
       <w:r>
         <w:rPr/>
@@ -1690,7 +1690,7 @@
         <w:pStyle w:val="Heading1"/>
         <w:rPr/>
       </w:pPr>
-      <w:bookmarkStart w:id="3" w:name="__RefHeading___Toc7556_3672760668"/>
+      <w:bookmarkStart w:id="3" w:name="__RefHeading___Toc7607_4122350189"/>
       <w:bookmarkStart w:id="4" w:name="processo-di-impact-analysis"/>
       <w:bookmarkEnd w:id="3"/>
       <w:r>
@@ -1703,7 +1703,7 @@
         <w:pStyle w:val="Heading2"/>
         <w:rPr/>
       </w:pPr>
-      <w:bookmarkStart w:id="5" w:name="__RefHeading___Toc7558_3672760668"/>
+      <w:bookmarkStart w:id="5" w:name="__RefHeading___Toc7609_4122350189"/>
       <w:bookmarkStart w:id="6" w:name="metodo-seguito"/>
       <w:bookmarkEnd w:id="5"/>
       <w:r>
@@ -1884,7 +1884,7 @@
         <w:pStyle w:val="Heading2"/>
         <w:rPr/>
       </w:pPr>
-      <w:bookmarkStart w:id="7" w:name="__RefHeading___Toc7560_3672760668"/>
+      <w:bookmarkStart w:id="7" w:name="__RefHeading___Toc7611_4122350189"/>
       <w:bookmarkStart w:id="8" w:name="evidenze-as-is"/>
       <w:bookmarkEnd w:id="7"/>
       <w:r>
@@ -2055,7 +2055,7 @@
         <w:pStyle w:val="Heading2"/>
         <w:rPr/>
       </w:pPr>
-      <w:bookmarkStart w:id="10" w:name="__RefHeading___Toc7562_3672760668"/>
+      <w:bookmarkStart w:id="10" w:name="__RefHeading___Toc7613_4122350189"/>
       <w:bookmarkEnd w:id="10"/>
       <w:r>
         <w:rPr/>
@@ -2691,7 +2691,7 @@
         <w:pStyle w:val="Heading2"/>
         <w:rPr/>
       </w:pPr>
-      <w:bookmarkStart w:id="12" w:name="__RefHeading___Toc7564_3672760668"/>
+      <w:bookmarkStart w:id="12" w:name="__RefHeading___Toc7615_4122350189"/>
       <w:bookmarkEnd w:id="12"/>
       <w:r>
         <w:rPr/>
@@ -3665,7 +3665,7 @@
         <w:pStyle w:val="Heading1"/>
         <w:rPr/>
       </w:pPr>
-      <w:bookmarkStart w:id="14" w:name="__RefHeading___Toc7566_3672760668"/>
+      <w:bookmarkStart w:id="14" w:name="__RefHeading___Toc7617_4122350189"/>
       <w:bookmarkStart w:id="15" w:name="progettazione-to-be"/>
       <w:bookmarkEnd w:id="14"/>
       <w:r>
@@ -3678,7 +3678,7 @@
         <w:pStyle w:val="Heading2"/>
         <w:rPr/>
       </w:pPr>
-      <w:bookmarkStart w:id="16" w:name="__RefHeading___Toc7568_3672760668"/>
+      <w:bookmarkStart w:id="16" w:name="__RefHeading___Toc7619_4122350189"/>
       <w:bookmarkStart w:id="17" w:name="servizio-di-dominio-unico"/>
       <w:bookmarkEnd w:id="16"/>
       <w:r>
@@ -3809,7 +3809,7 @@
         <w:pStyle w:val="Heading2"/>
         <w:rPr/>
       </w:pPr>
-      <w:bookmarkStart w:id="19" w:name="__RefHeading___Toc7570_3672760668"/>
+      <w:bookmarkStart w:id="19" w:name="__RefHeading___Toc7621_4122350189"/>
       <w:bookmarkStart w:id="20" w:name="atomicità-e-concorrenza"/>
       <w:bookmarkEnd w:id="19"/>
       <w:r>
@@ -3882,7 +3882,7 @@
         <w:pStyle w:val="Heading2"/>
         <w:rPr/>
       </w:pPr>
-      <w:bookmarkStart w:id="22" w:name="__RefHeading___Toc7572_3672760668"/>
+      <w:bookmarkStart w:id="22" w:name="__RefHeading___Toc7623_4122350189"/>
       <w:bookmarkStart w:id="23" w:name="modello-della-lista-dattesa"/>
       <w:bookmarkEnd w:id="22"/>
       <w:r>
@@ -3983,7 +3983,7 @@
         <w:pStyle w:val="Heading2"/>
         <w:rPr/>
       </w:pPr>
-      <w:bookmarkStart w:id="25" w:name="__RefHeading___Toc7574_3672760668"/>
+      <w:bookmarkStart w:id="25" w:name="__RefHeading___Toc7625_4122350189"/>
       <w:bookmarkStart w:id="26" w:name="identità-ruoli-e-ownership"/>
       <w:bookmarkEnd w:id="25"/>
       <w:r>
@@ -4088,7 +4088,7 @@
         <w:pStyle w:val="Heading2"/>
         <w:rPr/>
       </w:pPr>
-      <w:bookmarkStart w:id="28" w:name="__RefHeading___Toc7576_3672760668"/>
+      <w:bookmarkStart w:id="28" w:name="__RefHeading___Toc7627_4122350189"/>
       <w:bookmarkStart w:id="29" w:name="log-notifiche-e-aggiornamento-client"/>
       <w:bookmarkEnd w:id="28"/>
       <w:r>
@@ -4152,7 +4152,7 @@
         <w:pStyle w:val="Heading2"/>
         <w:rPr/>
       </w:pPr>
-      <w:bookmarkStart w:id="30" w:name="__RefHeading___Toc7578_3672760668"/>
+      <w:bookmarkStart w:id="30" w:name="__RefHeading___Toc7629_4122350189"/>
       <w:bookmarkStart w:id="31" w:name="diagrammi"/>
       <w:bookmarkEnd w:id="30"/>
       <w:r>
@@ -4273,7 +4273,7 @@
         <w:pStyle w:val="Heading1"/>
         <w:rPr/>
       </w:pPr>
-      <w:bookmarkStart w:id="34" w:name="__RefHeading___Toc7580_3672760668"/>
+      <w:bookmarkStart w:id="34" w:name="__RefHeading___Toc7631_4122350189"/>
       <w:bookmarkStart w:id="35" w:name="realizzazione-incrementale"/>
       <w:bookmarkEnd w:id="34"/>
       <w:r>
@@ -4286,7 +4286,7 @@
         <w:pStyle w:val="Heading2"/>
         <w:rPr/>
       </w:pPr>
-      <w:bookmarkStart w:id="36" w:name="__RefHeading___Toc7582_3672760668"/>
+      <w:bookmarkStart w:id="36" w:name="__RefHeading___Toc7633_4122350189"/>
       <w:bookmarkEnd w:id="36"/>
       <w:r>
         <w:rPr/>
@@ -5250,7 +5250,7 @@
         <w:pStyle w:val="Heading2"/>
         <w:rPr/>
       </w:pPr>
-      <w:bookmarkStart w:id="38" w:name="__RefHeading___Toc7584_3672760668"/>
+      <w:bookmarkStart w:id="38" w:name="__RefHeading___Toc7635_4122350189"/>
       <w:bookmarkEnd w:id="38"/>
       <w:r>
         <w:rPr/>
@@ -6006,7 +6006,7 @@
         <w:pStyle w:val="Heading2"/>
         <w:rPr/>
       </w:pPr>
-      <w:bookmarkStart w:id="39" w:name="__RefHeading___Toc7586_3672760668"/>
+      <w:bookmarkStart w:id="39" w:name="__RefHeading___Toc7637_4122350189"/>
       <w:bookmarkStart w:id="40" w:name="cronologia-git-sintetica"/>
       <w:bookmarkEnd w:id="39"/>
       <w:r>
@@ -7343,7 +7343,7 @@
         <w:pStyle w:val="Heading1"/>
         <w:rPr/>
       </w:pPr>
-      <w:bookmarkStart w:id="43" w:name="__RefHeading___Toc7588_3672760668"/>
+      <w:bookmarkStart w:id="43" w:name="__RefHeading___Toc7639_4122350189"/>
       <w:bookmarkStart w:id="44" w:name="criteri-di-accettazione-ed-evidenze"/>
       <w:bookmarkEnd w:id="43"/>
       <w:r>
@@ -8133,7 +8133,7 @@
         <w:pStyle w:val="Heading1"/>
         <w:rPr/>
       </w:pPr>
-      <w:bookmarkStart w:id="46" w:name="__RefHeading___Toc7590_3672760668"/>
+      <w:bookmarkStart w:id="46" w:name="__RefHeading___Toc7641_4122350189"/>
       <w:bookmarkStart w:id="47" w:name="strategia-ed-esiti-di-test"/>
       <w:bookmarkEnd w:id="46"/>
       <w:r>
@@ -8146,7 +8146,7 @@
         <w:pStyle w:val="Heading2"/>
         <w:rPr/>
       </w:pPr>
-      <w:bookmarkStart w:id="48" w:name="__RefHeading___Toc7592_3672760668"/>
+      <w:bookmarkStart w:id="48" w:name="__RefHeading___Toc7643_4122350189"/>
       <w:bookmarkEnd w:id="48"/>
       <w:r>
         <w:rPr/>
@@ -8671,7 +8671,7 @@
         <w:pStyle w:val="Heading2"/>
         <w:rPr/>
       </w:pPr>
-      <w:bookmarkStart w:id="50" w:name="__RefHeading___Toc7594_3672760668"/>
+      <w:bookmarkStart w:id="50" w:name="__RefHeading___Toc7645_4122350189"/>
       <w:bookmarkEnd w:id="50"/>
       <w:r>
         <w:rPr/>
@@ -8842,7 +8842,7 @@
         <w:pStyle w:val="Heading1"/>
         <w:rPr/>
       </w:pPr>
-      <w:bookmarkStart w:id="51" w:name="__RefHeading___Toc7596_3672760668"/>
+      <w:bookmarkStart w:id="51" w:name="__RefHeading___Toc7647_4122350189"/>
       <w:bookmarkStart w:id="52" w:name="anomalie-e-limiti-osservati"/>
       <w:bookmarkEnd w:id="51"/>
       <w:r>
@@ -8983,6 +8983,120 @@
         <w:rPr/>
         <w:t>) senza fix compatibile pubblicato. Non entra nel bundle di produzione.</w:t>
       </w:r>
+    </w:p>
+    <w:p>
+      <w:pPr>
+        <w:pStyle w:val="Compact"/>
+        <w:numPr>
+          <w:ilvl w:val="0"/>
+          <w:numId w:val="66"/>
+        </w:numPr>
+        <w:rPr/>
+      </w:pPr>
+      <w:r>
+        <w:rPr/>
+        <w:t xml:space="preserve">La verifica dal vivo dell’applicazione pubblicata (13 ottobre 2026) ha rilevato un difetto preesistente e indipendente dalla CR: nel catalogo </w:t>
+      </w:r>
+      <w:r>
+        <w:rPr>
+          <w:rStyle w:val="VerbatimChar"/>
+        </w:rPr>
+        <w:t>/libri</w:t>
+      </w:r>
+      <w:r>
+        <w:rPr/>
+        <w:t xml:space="preserve"> tutti i libri risultavano “Non disponibile” anche con copie libere, con anno e posizione vuoti, perché </w:t>
+      </w:r>
+      <w:r>
+        <w:rPr>
+          <w:rStyle w:val="VerbatimChar"/>
+        </w:rPr>
+        <w:t>GET /api/libri</w:t>
+      </w:r>
+      <w:r>
+        <w:rPr/>
+        <w:t xml:space="preserve"> restituiva il modello Prisma grezzo (</w:t>
+      </w:r>
+      <w:r>
+        <w:rPr>
+          <w:rStyle w:val="VerbatimChar"/>
+        </w:rPr>
+        <w:t>anno</w:t>
+      </w:r>
+      <w:r>
+        <w:rPr/>
+        <w:t xml:space="preserve">, </w:t>
+      </w:r>
+      <w:r>
+        <w:rPr>
+          <w:rStyle w:val="VerbatimChar"/>
+        </w:rPr>
+        <w:t>scaffale</w:t>
+      </w:r>
+      <w:r>
+        <w:rPr/>
+        <w:t xml:space="preserve">, </w:t>
+      </w:r>
+      <w:r>
+        <w:rPr>
+          <w:rStyle w:val="VerbatimChar"/>
+        </w:rPr>
+        <w:t>piano</w:t>
+      </w:r>
+      <w:r>
+        <w:rPr/>
+        <w:t xml:space="preserve">) mentre la pagina legge </w:t>
+      </w:r>
+      <w:r>
+        <w:rPr>
+          <w:rStyle w:val="VerbatimChar"/>
+        </w:rPr>
+        <w:t>disponibile</w:t>
+      </w:r>
+      <w:r>
+        <w:rPr/>
+        <w:t xml:space="preserve">, </w:t>
+      </w:r>
+      <w:r>
+        <w:rPr>
+          <w:rStyle w:val="VerbatimChar"/>
+        </w:rPr>
+        <w:t>annoPubblicazione</w:t>
+      </w:r>
+      <w:r>
+        <w:rPr/>
+        <w:t xml:space="preserve"> e </w:t>
+      </w:r>
+      <w:r>
+        <w:rPr>
+          <w:rStyle w:val="VerbatimChar"/>
+        </w:rPr>
+        <w:t>posizione</w:t>
+      </w:r>
+      <w:r>
+        <w:rPr/>
+        <w:t>. Il difetto non tocca prenotazioni, lista d’attesa e concorrenza. È corretto dalla PR #85 (</w:t>
+      </w:r>
+      <w:r>
+        <w:rPr>
+          <w:rStyle w:val="VerbatimChar"/>
+        </w:rPr>
+        <w:t>arricchisciLibro</w:t>
+      </w:r>
+      <w:r>
+        <w:rPr/>
+        <w:t xml:space="preserve"> in </w:t>
+      </w:r>
+      <w:r>
+        <w:rPr>
+          <w:rStyle w:val="VerbatimChar"/>
+        </w:rPr>
+        <w:t>src/lib/catalogo-libri.ts</w:t>
+      </w:r>
+      <w:r>
+        <w:rPr/>
+        <w:t>, con cinque test unitari), tenuta separata dalla PR #84 già verificata.</w:t>
+      </w:r>
       <w:bookmarkEnd w:id="52"/>
     </w:p>
     <w:p>
@@ -8990,7 +9104,7 @@
         <w:pStyle w:val="Heading1"/>
         <w:rPr/>
       </w:pPr>
-      <w:bookmarkStart w:id="53" w:name="__RefHeading___Toc7598_3672760668"/>
+      <w:bookmarkStart w:id="53" w:name="__RefHeading___Toc7649_4122350189"/>
       <w:bookmarkStart w:id="54" w:name="valutazione-finale"/>
       <w:bookmarkEnd w:id="53"/>
       <w:bookmarkEnd w:id="54"/>
@@ -9122,7 +9236,7 @@
         <w:spacing w:before="0" w:after="120"/>
         <w:rPr/>
       </w:pPr>
-      <w:bookmarkStart w:id="57" w:name="__RefHeading___Toc7600_3672760668"/>
+      <w:bookmarkStart w:id="57" w:name="__RefHeading___Toc7651_4122350189"/>
       <w:bookmarkStart w:id="58" w:name="X6b26a8375254fc4564533c6c3d12e0b5fffed05"/>
       <w:bookmarkEnd w:id="57"/>
       <w:bookmarkEnd w:id="58"/>
@@ -9136,7 +9250,7 @@
         <w:pStyle w:val="Heading2"/>
         <w:rPr/>
       </w:pPr>
-      <w:bookmarkStart w:id="59" w:name="__RefHeading___Toc7602_3672760668"/>
+      <w:bookmarkStart w:id="59" w:name="__RefHeading___Toc7653_4122350189"/>
       <w:bookmarkStart w:id="60" w:name="X345180dfa60e3e14b3fa4fce5fb6f823680a80f"/>
       <w:bookmarkEnd w:id="59"/>
       <w:r>
@@ -9190,7 +9304,7 @@
         <w:pStyle w:val="Compact"/>
         <w:numPr>
           <w:ilvl w:val="0"/>
-          <w:numId w:val="66"/>
+          <w:numId w:val="67"/>
         </w:numPr>
         <w:rPr/>
       </w:pPr>
@@ -9212,33 +9326,13 @@
         <w:pStyle w:val="Compact"/>
         <w:numPr>
           <w:ilvl w:val="0"/>
-          <w:numId w:val="67"/>
-        </w:numPr>
-        <w:rPr/>
-      </w:pPr>
-      <w:r>
-        <w:rPr/>
-        <w:t>Responsabile operativo: Renato Mancino, subentrato a Mario Celzo</w:t>
-      </w:r>
-    </w:p>
-    <w:p>
-      <w:pPr>
-        <w:pStyle w:val="Compact"/>
-        <w:numPr>
-          <w:ilvl w:val="0"/>
           <w:numId w:val="68"/>
         </w:numPr>
         <w:rPr/>
       </w:pPr>
       <w:r>
         <w:rPr/>
-        <w:t xml:space="preserve">Baseline funzionale: tag </w:t>
-      </w:r>
-      <w:r>
-        <w:rPr>
-          <w:rStyle w:val="VerbatimChar"/>
-        </w:rPr>
-        <w:t>baseline-pre-cr-bf-01</w:t>
+        <w:t>Responsabile operativo: Renato Mancino, subentrato a Mario Celzo</w:t>
       </w:r>
     </w:p>
     <w:p>
@@ -9252,7 +9346,13 @@
       </w:pPr>
       <w:r>
         <w:rPr/>
-        <w:t>Criteri di accettazione CR-BF-01: nessuno specifico; il documento alimenta l’impact analysis</w:t>
+        <w:t xml:space="preserve">Baseline funzionale: tag </w:t>
+      </w:r>
+      <w:r>
+        <w:rPr>
+          <w:rStyle w:val="VerbatimChar"/>
+        </w:rPr>
+        <w:t>baseline-pre-cr-bf-01</w:t>
       </w:r>
     </w:p>
     <w:p>
@@ -9266,7 +9366,7 @@
       </w:pPr>
       <w:r>
         <w:rPr/>
-        <w:t>Documento complementare: BIB-17 — diagramma delle transizioni di stato</w:t>
+        <w:t>Criteri di accettazione CR-BF-01: nessuno specifico; il documento alimenta l’impact analysis</w:t>
       </w:r>
     </w:p>
     <w:p>
@@ -9275,6 +9375,20 @@
         <w:numPr>
           <w:ilvl w:val="0"/>
           <w:numId w:val="71"/>
+        </w:numPr>
+        <w:rPr/>
+      </w:pPr>
+      <w:r>
+        <w:rPr/>
+        <w:t>Documento complementare: BIB-17 — diagramma delle transizioni di stato</w:t>
+      </w:r>
+    </w:p>
+    <w:p>
+      <w:pPr>
+        <w:pStyle w:val="Compact"/>
+        <w:numPr>
+          <w:ilvl w:val="0"/>
+          <w:numId w:val="72"/>
         </w:numPr>
         <w:rPr/>
       </w:pPr>
@@ -9782,7 +9896,7 @@
         <w:pStyle w:val="Compact"/>
         <w:numPr>
           <w:ilvl w:val="0"/>
-          <w:numId w:val="72"/>
+          <w:numId w:val="73"/>
         </w:numPr>
         <w:rPr/>
       </w:pPr>
@@ -9813,7 +9927,7 @@
         <w:pStyle w:val="Compact"/>
         <w:numPr>
           <w:ilvl w:val="0"/>
-          <w:numId w:val="73"/>
+          <w:numId w:val="74"/>
         </w:numPr>
         <w:rPr/>
       </w:pPr>
@@ -9844,7 +9958,7 @@
         <w:pStyle w:val="Compact"/>
         <w:numPr>
           <w:ilvl w:val="0"/>
-          <w:numId w:val="74"/>
+          <w:numId w:val="75"/>
         </w:numPr>
         <w:rPr/>
       </w:pPr>
@@ -9865,7 +9979,7 @@
         <w:pStyle w:val="Compact"/>
         <w:numPr>
           <w:ilvl w:val="0"/>
-          <w:numId w:val="75"/>
+          <w:numId w:val="76"/>
         </w:numPr>
         <w:rPr/>
       </w:pPr>
@@ -9890,7 +10004,7 @@
         <w:pStyle w:val="Compact"/>
         <w:numPr>
           <w:ilvl w:val="0"/>
-          <w:numId w:val="76"/>
+          <w:numId w:val="77"/>
         </w:numPr>
         <w:rPr/>
       </w:pPr>
@@ -9921,7 +10035,7 @@
         <w:rPr/>
         <w:drawing>
           <wp:inline distT="0" distB="0" distL="0" distR="0">
-            <wp:extent cx="5760085" cy="4246245"/>
+            <wp:extent cx="5760085" cy="4217035"/>
             <wp:effectExtent l="0" t="0" r="0" b="0"/>
             <wp:docPr id="1" name="Picture" descr=""/>
             <wp:cNvGraphicFramePr>
@@ -9945,7 +10059,7 @@
                   <pic:spPr bwMode="auto">
                     <a:xfrm>
                       <a:off x="0" y="0"/>
-                      <a:ext cx="5760085" cy="4246245"/>
+                      <a:ext cx="5760085" cy="4217035"/>
                     </a:xfrm>
                     <a:prstGeom prst="rect">
                       <a:avLst/>
@@ -13008,7 +13122,7 @@
         <w:pStyle w:val="Compact"/>
         <w:numPr>
           <w:ilvl w:val="0"/>
-          <w:numId w:val="77"/>
+          <w:numId w:val="78"/>
         </w:numPr>
         <w:rPr/>
       </w:pPr>
@@ -13059,7 +13173,7 @@
         <w:pStyle w:val="Compact"/>
         <w:numPr>
           <w:ilvl w:val="0"/>
-          <w:numId w:val="78"/>
+          <w:numId w:val="79"/>
         </w:numPr>
         <w:rPr/>
       </w:pPr>
@@ -13080,7 +13194,7 @@
         <w:pStyle w:val="Compact"/>
         <w:numPr>
           <w:ilvl w:val="0"/>
-          <w:numId w:val="79"/>
+          <w:numId w:val="80"/>
         </w:numPr>
         <w:rPr/>
       </w:pPr>
@@ -13101,7 +13215,7 @@
         <w:pStyle w:val="Compact"/>
         <w:numPr>
           <w:ilvl w:val="0"/>
-          <w:numId w:val="80"/>
+          <w:numId w:val="81"/>
         </w:numPr>
         <w:rPr/>
       </w:pPr>
@@ -13133,7 +13247,7 @@
         <w:pStyle w:val="Compact"/>
         <w:numPr>
           <w:ilvl w:val="0"/>
-          <w:numId w:val="81"/>
+          <w:numId w:val="82"/>
         </w:numPr>
         <w:rPr/>
       </w:pPr>
@@ -13154,7 +13268,7 @@
         <w:pStyle w:val="Compact"/>
         <w:numPr>
           <w:ilvl w:val="0"/>
-          <w:numId w:val="82"/>
+          <w:numId w:val="83"/>
         </w:numPr>
         <w:rPr/>
       </w:pPr>
@@ -13205,7 +13319,7 @@
         <w:pStyle w:val="Compact"/>
         <w:numPr>
           <w:ilvl w:val="0"/>
-          <w:numId w:val="83"/>
+          <w:numId w:val="84"/>
         </w:numPr>
         <w:rPr/>
       </w:pPr>
@@ -13226,7 +13340,7 @@
         <w:pStyle w:val="Compact"/>
         <w:numPr>
           <w:ilvl w:val="0"/>
-          <w:numId w:val="84"/>
+          <w:numId w:val="85"/>
         </w:numPr>
         <w:rPr/>
       </w:pPr>
@@ -13247,7 +13361,7 @@
         <w:pStyle w:val="Compact"/>
         <w:numPr>
           <w:ilvl w:val="0"/>
-          <w:numId w:val="85"/>
+          <w:numId w:val="86"/>
         </w:numPr>
         <w:rPr/>
       </w:pPr>
@@ -13268,7 +13382,7 @@
         <w:pStyle w:val="Compact"/>
         <w:numPr>
           <w:ilvl w:val="0"/>
-          <w:numId w:val="86"/>
+          <w:numId w:val="87"/>
         </w:numPr>
         <w:rPr/>
       </w:pPr>
@@ -13289,7 +13403,7 @@
         <w:pStyle w:val="Compact"/>
         <w:numPr>
           <w:ilvl w:val="0"/>
-          <w:numId w:val="87"/>
+          <w:numId w:val="88"/>
         </w:numPr>
         <w:rPr/>
       </w:pPr>
@@ -13344,7 +13458,7 @@
         <w:pStyle w:val="Heading2"/>
         <w:rPr/>
       </w:pPr>
-      <w:bookmarkStart w:id="69" w:name="__RefHeading___Toc7604_3672760668"/>
+      <w:bookmarkStart w:id="69" w:name="__RefHeading___Toc7655_4122350189"/>
       <w:bookmarkStart w:id="70" w:name="stati-di-prenotazione-as-is"/>
       <w:bookmarkEnd w:id="69"/>
       <w:r>
@@ -13412,7 +13526,7 @@
         <w:rPr/>
         <w:drawing>
           <wp:inline distT="0" distB="0" distL="0" distR="0">
-            <wp:extent cx="5760085" cy="1322070"/>
+            <wp:extent cx="5760085" cy="1351915"/>
             <wp:effectExtent l="0" t="0" r="0" b="0"/>
             <wp:docPr id="2" name="Image2" descr=""/>
             <wp:cNvGraphicFramePr>
@@ -13436,7 +13550,7 @@
                   <pic:spPr bwMode="auto">
                     <a:xfrm>
                       <a:off x="0" y="0"/>
-                      <a:ext cx="5760085" cy="1322070"/>
+                      <a:ext cx="5760085" cy="1351915"/>
                     </a:xfrm>
                     <a:prstGeom prst="rect">
                       <a:avLst/>
@@ -15481,7 +15595,7 @@
         <w:pStyle w:val="Heading2"/>
         <w:rPr/>
       </w:pPr>
-      <w:bookmarkStart w:id="72" w:name="__RefHeading___Toc7606_3672760668"/>
+      <w:bookmarkStart w:id="72" w:name="__RefHeading___Toc7657_4122350189"/>
       <w:bookmarkStart w:id="73" w:name="matrice-ruoli-operazioni-as-is"/>
       <w:bookmarkEnd w:id="72"/>
       <w:bookmarkEnd w:id="73"/>
@@ -15556,7 +15670,7 @@
         <w:pStyle w:val="Compact"/>
         <w:numPr>
           <w:ilvl w:val="0"/>
-          <w:numId w:val="88"/>
+          <w:numId w:val="89"/>
         </w:numPr>
         <w:rPr/>
       </w:pPr>
@@ -15578,43 +15692,13 @@
         <w:pStyle w:val="Compact"/>
         <w:numPr>
           <w:ilvl w:val="0"/>
-          <w:numId w:val="89"/>
-        </w:numPr>
-        <w:rPr/>
-      </w:pPr>
-      <w:r>
-        <w:rPr/>
-        <w:t>Responsabile operativo: Renato Mancino, subentrato ad Alfonso Ferrara</w:t>
-      </w:r>
-    </w:p>
-    <w:p>
-      <w:pPr>
-        <w:pStyle w:val="Compact"/>
-        <w:numPr>
-          <w:ilvl w:val="0"/>
           <w:numId w:val="90"/>
         </w:numPr>
         <w:rPr/>
       </w:pPr>
       <w:r>
         <w:rPr/>
-        <w:t xml:space="preserve">Ambito completo: </w:t>
-      </w:r>
-      <w:r>
-        <w:rPr>
-          <w:rStyle w:val="VerbatimChar"/>
-        </w:rPr>
-        <w:t>src/app/api/prenotazioni/**</w:t>
-      </w:r>
-      <w:r>
-        <w:rPr/>
-        <w:t xml:space="preserve"> e </w:t>
-      </w:r>
-      <w:r>
-        <w:rPr>
-          <w:rStyle w:val="VerbatimChar"/>
-        </w:rPr>
-        <w:t>src/app/api/admin/**</w:t>
+        <w:t>Responsabile operativo: Renato Mancino, subentrato ad Alfonso Ferrara</w:t>
       </w:r>
     </w:p>
     <w:p>
@@ -15628,7 +15712,23 @@
       </w:pPr>
       <w:r>
         <w:rPr/>
-        <w:t>Inventario: 16 file route, 23 operazioni HTTP</w:t>
+        <w:t xml:space="preserve">Ambito completo: </w:t>
+      </w:r>
+      <w:r>
+        <w:rPr>
+          <w:rStyle w:val="VerbatimChar"/>
+        </w:rPr>
+        <w:t>src/app/api/prenotazioni/**</w:t>
+      </w:r>
+      <w:r>
+        <w:rPr/>
+        <w:t xml:space="preserve"> e </w:t>
+      </w:r>
+      <w:r>
+        <w:rPr>
+          <w:rStyle w:val="VerbatimChar"/>
+        </w:rPr>
+        <w:t>src/app/api/admin/**</w:t>
       </w:r>
     </w:p>
     <w:p>
@@ -15637,6 +15737,20 @@
         <w:numPr>
           <w:ilvl w:val="0"/>
           <w:numId w:val="92"/>
+        </w:numPr>
+        <w:rPr/>
+      </w:pPr>
+      <w:r>
+        <w:rPr/>
+        <w:t>Inventario: 16 file route, 23 operazioni HTTP</w:t>
+      </w:r>
+    </w:p>
+    <w:p>
+      <w:pPr>
+        <w:pStyle w:val="Compact"/>
+        <w:numPr>
+          <w:ilvl w:val="0"/>
+          <w:numId w:val="93"/>
         </w:numPr>
         <w:rPr/>
       </w:pPr>
@@ -22806,7 +22920,7 @@
         <w:pStyle w:val="Compact"/>
         <w:numPr>
           <w:ilvl w:val="0"/>
-          <w:numId w:val="93"/>
+          <w:numId w:val="94"/>
         </w:numPr>
         <w:rPr/>
       </w:pPr>
@@ -22826,7 +22940,7 @@
         <w:pStyle w:val="Compact"/>
         <w:numPr>
           <w:ilvl w:val="0"/>
-          <w:numId w:val="94"/>
+          <w:numId w:val="95"/>
         </w:numPr>
         <w:rPr/>
       </w:pPr>
@@ -24888,7 +25002,7 @@
         <w:pStyle w:val="Compact"/>
         <w:numPr>
           <w:ilvl w:val="0"/>
-          <w:numId w:val="95"/>
+          <w:numId w:val="96"/>
         </w:numPr>
         <w:rPr/>
       </w:pPr>
@@ -24902,7 +25016,7 @@
         <w:pStyle w:val="Compact"/>
         <w:numPr>
           <w:ilvl w:val="0"/>
-          <w:numId w:val="96"/>
+          <w:numId w:val="97"/>
         </w:numPr>
         <w:rPr/>
       </w:pPr>
@@ -24924,7 +25038,7 @@
         <w:pStyle w:val="Compact"/>
         <w:numPr>
           <w:ilvl w:val="0"/>
-          <w:numId w:val="97"/>
+          <w:numId w:val="98"/>
         </w:numPr>
         <w:rPr/>
       </w:pPr>
@@ -24990,7 +25104,7 @@
         <w:spacing w:before="0" w:after="120"/>
         <w:rPr/>
       </w:pPr>
-      <w:bookmarkStart w:id="88" w:name="__RefHeading___Toc7608_3672760668"/>
+      <w:bookmarkStart w:id="88" w:name="__RefHeading___Toc7659_4122350189"/>
       <w:bookmarkStart w:id="89" w:name="appendice-b-progettazione-to-be"/>
       <w:bookmarkEnd w:id="88"/>
       <w:bookmarkEnd w:id="89"/>
@@ -25004,7 +25118,7 @@
         <w:pStyle w:val="Heading2"/>
         <w:rPr/>
       </w:pPr>
-      <w:bookmarkStart w:id="90" w:name="__RefHeading___Toc7610_3672760668"/>
+      <w:bookmarkStart w:id="90" w:name="__RefHeading___Toc7661_4122350189"/>
       <w:bookmarkStart w:id="91" w:name="Xd6a0c6f01f596988a6401a90c655cfdd37ac9a6"/>
       <w:bookmarkEnd w:id="90"/>
       <w:r>
@@ -25058,7 +25172,7 @@
         <w:pStyle w:val="Compact"/>
         <w:numPr>
           <w:ilvl w:val="0"/>
-          <w:numId w:val="98"/>
+          <w:numId w:val="99"/>
         </w:numPr>
         <w:rPr/>
       </w:pPr>
@@ -25080,7 +25194,7 @@
         <w:pStyle w:val="Compact"/>
         <w:numPr>
           <w:ilvl w:val="0"/>
-          <w:numId w:val="99"/>
+          <w:numId w:val="100"/>
         </w:numPr>
         <w:rPr/>
       </w:pPr>
@@ -25093,20 +25207,6 @@
           <w:rStyle w:val="VerbatimChar"/>
         </w:rPr>
         <w:t>main</w:t>
-      </w:r>
-    </w:p>
-    <w:p>
-      <w:pPr>
-        <w:pStyle w:val="Compact"/>
-        <w:numPr>
-          <w:ilvl w:val="0"/>
-          <w:numId w:val="100"/>
-        </w:numPr>
-        <w:rPr/>
-      </w:pPr>
-      <w:r>
-        <w:rPr/>
-        <w:t>Vista complementare: stati TO-BE</w:t>
       </w:r>
     </w:p>
     <w:p>
@@ -25118,6 +25218,20 @@
         </w:numPr>
         <w:rPr/>
       </w:pPr>
+      <w:r>
+        <w:rPr/>
+        <w:t>Vista complementare: stati TO-BE</w:t>
+      </w:r>
+    </w:p>
+    <w:p>
+      <w:pPr>
+        <w:pStyle w:val="Compact"/>
+        <w:numPr>
+          <w:ilvl w:val="0"/>
+          <w:numId w:val="102"/>
+        </w:numPr>
+        <w:rPr/>
+      </w:pPr>
       <w:bookmarkStart w:id="93" w:name="scopo-e-riferimenti"/>
       <w:r>
         <w:rPr/>
@@ -25147,7 +25261,7 @@
         <w:rPr/>
         <w:drawing>
           <wp:inline distT="0" distB="0" distL="0" distR="0">
-            <wp:extent cx="5760085" cy="4628515"/>
+            <wp:extent cx="5760085" cy="4540250"/>
             <wp:effectExtent l="0" t="0" r="0" b="0"/>
             <wp:docPr id="3" name="Image3" descr=""/>
             <wp:cNvGraphicFramePr>
@@ -25171,7 +25285,7 @@
                   <pic:spPr bwMode="auto">
                     <a:xfrm>
                       <a:off x="0" y="0"/>
-                      <a:ext cx="5760085" cy="4628515"/>
+                      <a:ext cx="5760085" cy="4540250"/>
                     </a:xfrm>
                     <a:prstGeom prst="rect">
                       <a:avLst/>
@@ -26327,47 +26441,13 @@
         <w:pStyle w:val="Compact"/>
         <w:numPr>
           <w:ilvl w:val="0"/>
-          <w:numId w:val="102"/>
-        </w:numPr>
-        <w:rPr/>
-      </w:pPr>
-      <w:r>
-        <w:rPr/>
-        <w:t>La route di creazione ricava l’utente dalla sessione e delega la scrittura atomica al servizio di dominio; il vincolo PostgreSQL resta l’ultima difesa.</w:t>
-      </w:r>
-    </w:p>
-    <w:p>
-      <w:pPr>
-        <w:pStyle w:val="Compact"/>
-        <w:numPr>
-          <w:ilvl w:val="0"/>
           <w:numId w:val="103"/>
         </w:numPr>
         <w:rPr/>
       </w:pPr>
       <w:r>
         <w:rPr/>
-        <w:t xml:space="preserve">In caso di intervallo occupato, la UI propone la coda e la route dedicata crea una </w:t>
-      </w:r>
-      <w:r>
-        <w:rPr>
-          <w:rStyle w:val="VerbatimChar"/>
-        </w:rPr>
-        <w:t>ListaAttesa</w:t>
-      </w:r>
-      <w:r>
-        <w:rPr/>
-        <w:t xml:space="preserve"> </w:t>
-      </w:r>
-      <w:r>
-        <w:rPr>
-          <w:rStyle w:val="VerbatimChar"/>
-        </w:rPr>
-        <w:t>IN_ATTESA</w:t>
-      </w:r>
-      <w:r>
-        <w:rPr/>
-        <w:t>, con posizione FIFO calcolata dal dominio.</w:t>
+        <w:t>La route di creazione ricava l’utente dalla sessione e delega la scrittura atomica al servizio di dominio; il vincolo PostgreSQL resta l’ultima difesa.</w:t>
       </w:r>
     </w:p>
     <w:p>
@@ -26381,37 +26461,27 @@
       </w:pPr>
       <w:r>
         <w:rPr/>
-        <w:t xml:space="preserve">Cancellazione del personale o no-show liberano lo slot e invocano la stessa funzione </w:t>
+        <w:t xml:space="preserve">In caso di intervallo occupato, la UI propone la coda e la route dedicata crea una </w:t>
       </w:r>
       <w:r>
         <w:rPr>
           <w:rStyle w:val="VerbatimChar"/>
         </w:rPr>
-        <w:t>promuoviPrimoInCoda</w:t>
-      </w:r>
-      <w:r>
-        <w:rPr/>
-        <w:t xml:space="preserve">; la promozione crea una </w:t>
+        <w:t>ListaAttesa</w:t>
+      </w:r>
+      <w:r>
+        <w:rPr/>
+        <w:t xml:space="preserve"> </w:t>
       </w:r>
       <w:r>
         <w:rPr>
           <w:rStyle w:val="VerbatimChar"/>
         </w:rPr>
-        <w:t>Prenotazione</w:t>
-      </w:r>
-      <w:r>
-        <w:rPr/>
-        <w:t xml:space="preserve">, aggiorna la richiesta e registra </w:t>
-      </w:r>
-      <w:r>
-        <w:rPr>
-          <w:rStyle w:val="VerbatimChar"/>
-        </w:rPr>
-        <w:t>CODA_PROMOZIONE</w:t>
-      </w:r>
-      <w:r>
-        <w:rPr/>
-        <w:t xml:space="preserve"> nella medesima transazione.</w:t>
+        <w:t>IN_ATTESA</w:t>
+      </w:r>
+      <w:r>
+        <w:rPr/>
+        <w:t>, con posizione FIFO calcolata dal dominio.</w:t>
       </w:r>
     </w:p>
     <w:p>
@@ -26425,7 +26495,37 @@
       </w:pPr>
       <w:r>
         <w:rPr/>
-        <w:t>Una promozione non confermata tramite check-in scade; automazione, notifica, audit e promozione del successivo chiudono il ciclo della coda.</w:t>
+        <w:t xml:space="preserve">Cancellazione del personale o no-show liberano lo slot e invocano la stessa funzione </w:t>
+      </w:r>
+      <w:r>
+        <w:rPr>
+          <w:rStyle w:val="VerbatimChar"/>
+        </w:rPr>
+        <w:t>promuoviPrimoInCoda</w:t>
+      </w:r>
+      <w:r>
+        <w:rPr/>
+        <w:t xml:space="preserve">; la promozione crea una </w:t>
+      </w:r>
+      <w:r>
+        <w:rPr>
+          <w:rStyle w:val="VerbatimChar"/>
+        </w:rPr>
+        <w:t>Prenotazione</w:t>
+      </w:r>
+      <w:r>
+        <w:rPr/>
+        <w:t xml:space="preserve">, aggiorna la richiesta e registra </w:t>
+      </w:r>
+      <w:r>
+        <w:rPr>
+          <w:rStyle w:val="VerbatimChar"/>
+        </w:rPr>
+        <w:t>CODA_PROMOZIONE</w:t>
+      </w:r>
+      <w:r>
+        <w:rPr/>
+        <w:t xml:space="preserve"> nella medesima transazione.</w:t>
       </w:r>
     </w:p>
     <w:p>
@@ -26439,104 +26539,7 @@
       </w:pPr>
       <w:r>
         <w:rPr/>
-        <w:t>La UI rilegge disponibilità e notifiche tramite API autenticate; i dettagli personali restano nelle notifiche persistenti del solo destinatario.</w:t>
-      </w:r>
-    </w:p>
-    <w:p>
-      <w:pPr>
-        <w:pStyle w:val="Heading3"/>
-        <w:rPr/>
-      </w:pPr>
-      <w:bookmarkStart w:id="97" w:name="confini"/>
-      <w:r>
-        <w:rPr/>
-        <w:t>Confini</w:t>
-      </w:r>
-    </w:p>
-    <w:p>
-      <w:pPr>
-        <w:pStyle w:val="FirstParagraph"/>
-        <w:rPr/>
-      </w:pPr>
-      <w:r>
-        <w:rPr/>
-        <w:t xml:space="preserve">Il diagramma rappresenta dipendenze presenti nel codice finale. Non attribuisce a </w:t>
-      </w:r>
-      <w:r>
-        <w:rPr>
-          <w:rStyle w:val="VerbatimChar"/>
-        </w:rPr>
-        <w:t>ListaAttesa</w:t>
-      </w:r>
-      <w:r>
-        <w:rPr/>
-        <w:t xml:space="preserve"> lo stato di una prenotazione: le due entità mantengono cicli di vita separati e vengono correlate dall’audit </w:t>
-      </w:r>
-      <w:r>
-        <w:rPr>
-          <w:rStyle w:val="VerbatimChar"/>
-        </w:rPr>
-        <w:t>CODA_PROMOZIONE</w:t>
-      </w:r>
-      <w:r>
-        <w:rPr/>
-        <w:t>.</w:t>
-      </w:r>
-      <w:bookmarkEnd w:id="91"/>
-      <w:bookmarkEnd w:id="97"/>
-    </w:p>
-    <w:p>
-      <w:pPr>
-        <w:pStyle w:val="Heading2"/>
-        <w:rPr/>
-      </w:pPr>
-      <w:bookmarkStart w:id="98" w:name="__RefHeading___Toc7612_3672760668"/>
-      <w:bookmarkStart w:id="99" w:name="X2850bc93332866d7b33826adee665ca4a2d23cd"/>
-      <w:bookmarkEnd w:id="98"/>
-      <w:r>
-        <w:rPr/>
-        <w:t>Stati di prenotazione e lista d’attesa — TO-BE</w:t>
-      </w:r>
-    </w:p>
-    <w:p>
-      <w:pPr>
-        <w:pStyle w:val="Heading3"/>
-        <w:rPr/>
-      </w:pPr>
-      <w:bookmarkStart w:id="100" w:name="scopo-e-convenzioni"/>
-      <w:r>
-        <w:rPr/>
-        <w:t>Scopo e convenzioni</w:t>
-      </w:r>
-    </w:p>
-    <w:p>
-      <w:pPr>
-        <w:pStyle w:val="FirstParagraph"/>
-        <w:rPr/>
-      </w:pPr>
-      <w:r>
-        <w:rPr/>
-        <w:t xml:space="preserve">Il TO-BE distingue le due entità persistenti introdotte o modificate dalla CR-BF-01. </w:t>
-      </w:r>
-      <w:r>
-        <w:rPr>
-          <w:rStyle w:val="VerbatimChar"/>
-        </w:rPr>
-        <w:t>ListaAttesa</w:t>
-      </w:r>
-      <w:r>
-        <w:rPr/>
-        <w:t xml:space="preserve"> non è uno stato di </w:t>
-      </w:r>
-      <w:r>
-        <w:rPr>
-          <w:rStyle w:val="VerbatimChar"/>
-        </w:rPr>
-        <w:t>Prenotazione</w:t>
-      </w:r>
-      <w:r>
-        <w:rPr/>
-        <w:t>: una prenotazione nasce solo dalla creazione diretta riuscita o da una promozione FIFO.</w:t>
+        <w:t>Una promozione non confermata tramite check-in scade; automazione, notifica, audit e promozione del successivo chiudono il ciclo della coda.</w:t>
       </w:r>
     </w:p>
     <w:p>
@@ -26550,7 +26553,104 @@
       </w:pPr>
       <w:r>
         <w:rPr/>
-        <w:t>Analisi precedente: stati Prenotazione AS-IS</w:t>
+        <w:t>La UI rilegge disponibilità e notifiche tramite API autenticate; i dettagli personali restano nelle notifiche persistenti del solo destinatario.</w:t>
+      </w:r>
+    </w:p>
+    <w:p>
+      <w:pPr>
+        <w:pStyle w:val="Heading3"/>
+        <w:rPr/>
+      </w:pPr>
+      <w:bookmarkStart w:id="97" w:name="confini"/>
+      <w:r>
+        <w:rPr/>
+        <w:t>Confini</w:t>
+      </w:r>
+    </w:p>
+    <w:p>
+      <w:pPr>
+        <w:pStyle w:val="FirstParagraph"/>
+        <w:rPr/>
+      </w:pPr>
+      <w:r>
+        <w:rPr/>
+        <w:t xml:space="preserve">Il diagramma rappresenta dipendenze presenti nel codice finale. Non attribuisce a </w:t>
+      </w:r>
+      <w:r>
+        <w:rPr>
+          <w:rStyle w:val="VerbatimChar"/>
+        </w:rPr>
+        <w:t>ListaAttesa</w:t>
+      </w:r>
+      <w:r>
+        <w:rPr/>
+        <w:t xml:space="preserve"> lo stato di una prenotazione: le due entità mantengono cicli di vita separati e vengono correlate dall’audit </w:t>
+      </w:r>
+      <w:r>
+        <w:rPr>
+          <w:rStyle w:val="VerbatimChar"/>
+        </w:rPr>
+        <w:t>CODA_PROMOZIONE</w:t>
+      </w:r>
+      <w:r>
+        <w:rPr/>
+        <w:t>.</w:t>
+      </w:r>
+      <w:bookmarkEnd w:id="91"/>
+      <w:bookmarkEnd w:id="97"/>
+    </w:p>
+    <w:p>
+      <w:pPr>
+        <w:pStyle w:val="Heading2"/>
+        <w:rPr/>
+      </w:pPr>
+      <w:bookmarkStart w:id="98" w:name="__RefHeading___Toc7663_4122350189"/>
+      <w:bookmarkStart w:id="99" w:name="X2850bc93332866d7b33826adee665ca4a2d23cd"/>
+      <w:bookmarkEnd w:id="98"/>
+      <w:r>
+        <w:rPr/>
+        <w:t>Stati di prenotazione e lista d’attesa — TO-BE</w:t>
+      </w:r>
+    </w:p>
+    <w:p>
+      <w:pPr>
+        <w:pStyle w:val="Heading3"/>
+        <w:rPr/>
+      </w:pPr>
+      <w:bookmarkStart w:id="100" w:name="scopo-e-convenzioni"/>
+      <w:r>
+        <w:rPr/>
+        <w:t>Scopo e convenzioni</w:t>
+      </w:r>
+    </w:p>
+    <w:p>
+      <w:pPr>
+        <w:pStyle w:val="FirstParagraph"/>
+        <w:rPr/>
+      </w:pPr>
+      <w:r>
+        <w:rPr/>
+        <w:t xml:space="preserve">Il TO-BE distingue le due entità persistenti introdotte o modificate dalla CR-BF-01. </w:t>
+      </w:r>
+      <w:r>
+        <w:rPr>
+          <w:rStyle w:val="VerbatimChar"/>
+        </w:rPr>
+        <w:t>ListaAttesa</w:t>
+      </w:r>
+      <w:r>
+        <w:rPr/>
+        <w:t xml:space="preserve"> non è uno stato di </w:t>
+      </w:r>
+      <w:r>
+        <w:rPr>
+          <w:rStyle w:val="VerbatimChar"/>
+        </w:rPr>
+        <w:t>Prenotazione</w:t>
+      </w:r>
+      <w:r>
+        <w:rPr/>
+        <w:t>: una prenotazione nasce solo dalla creazione diretta riuscita o da una promozione FIFO.</w:t>
       </w:r>
     </w:p>
     <w:p>
@@ -26564,7 +26664,7 @@
       </w:pPr>
       <w:r>
         <w:rPr/>
-        <w:t>Architettura aggiornata: componenti TO-BE</w:t>
+        <w:t>Analisi precedente: stati Prenotazione AS-IS</w:t>
       </w:r>
     </w:p>
     <w:p>
@@ -26576,6 +26676,20 @@
         </w:numPr>
         <w:rPr/>
       </w:pPr>
+      <w:r>
+        <w:rPr/>
+        <w:t>Architettura aggiornata: componenti TO-BE</w:t>
+      </w:r>
+    </w:p>
+    <w:p>
+      <w:pPr>
+        <w:pStyle w:val="Compact"/>
+        <w:numPr>
+          <w:ilvl w:val="0"/>
+          <w:numId w:val="110"/>
+        </w:numPr>
+        <w:rPr/>
+      </w:pPr>
       <w:bookmarkStart w:id="101" w:name="scopo-e-convenzioni"/>
       <w:r>
         <w:rPr/>
@@ -26605,7 +26719,7 @@
         <w:rPr/>
         <w:drawing>
           <wp:inline distT="0" distB="0" distL="0" distR="0">
-            <wp:extent cx="5760085" cy="1763395"/>
+            <wp:extent cx="5760085" cy="1816100"/>
             <wp:effectExtent l="0" t="0" r="0" b="0"/>
             <wp:docPr id="4" name="Image4" descr=""/>
             <wp:cNvGraphicFramePr>
@@ -26629,7 +26743,7 @@
                   <pic:spPr bwMode="auto">
                     <a:xfrm>
                       <a:off x="0" y="0"/>
-                      <a:ext cx="5760085" cy="1763395"/>
+                      <a:ext cx="5760085" cy="1816100"/>
                     </a:xfrm>
                     <a:prstGeom prst="rect">
                       <a:avLst/>
@@ -26665,7 +26779,7 @@
         <w:rPr/>
         <w:drawing>
           <wp:inline distT="0" distB="0" distL="0" distR="0">
-            <wp:extent cx="5760085" cy="1410335"/>
+            <wp:extent cx="5760085" cy="1478280"/>
             <wp:effectExtent l="0" t="0" r="0" b="0"/>
             <wp:docPr id="5" name="Image5" descr=""/>
             <wp:cNvGraphicFramePr>
@@ -26689,7 +26803,7 @@
                   <pic:spPr bwMode="auto">
                     <a:xfrm>
                       <a:off x="0" y="0"/>
-                      <a:ext cx="5760085" cy="1410335"/>
+                      <a:ext cx="5760085" cy="1478280"/>
                     </a:xfrm>
                     <a:prstGeom prst="rect">
                       <a:avLst/>
@@ -26725,7 +26839,7 @@
         <w:rPr/>
         <w:drawing>
           <wp:inline distT="0" distB="0" distL="0" distR="0">
-            <wp:extent cx="5760085" cy="3300095"/>
+            <wp:extent cx="5760085" cy="3285490"/>
             <wp:effectExtent l="0" t="0" r="0" b="0"/>
             <wp:docPr id="6" name="Image6" descr=""/>
             <wp:cNvGraphicFramePr>
@@ -26749,7 +26863,7 @@
                   <pic:spPr bwMode="auto">
                     <a:xfrm>
                       <a:off x="0" y="0"/>
-                      <a:ext cx="5760085" cy="3300095"/>
+                      <a:ext cx="5760085" cy="3285490"/>
                     </a:xfrm>
                     <a:prstGeom prst="rect">
                       <a:avLst/>
@@ -28956,7 +29070,7 @@
         <w:pStyle w:val="Heading2"/>
         <w:rPr/>
       </w:pPr>
-      <w:bookmarkStart w:id="111" w:name="__RefHeading___Toc7614_3672760668"/>
+      <w:bookmarkStart w:id="111" w:name="__RefHeading___Toc7665_4122350189"/>
       <w:bookmarkStart w:id="112" w:name="X5a14547f53ee4b9de1bdbf19b5a613b8dbcf22b"/>
       <w:bookmarkEnd w:id="111"/>
       <w:bookmarkEnd w:id="112"/>
@@ -31606,7 +31720,7 @@
         <w:rPr/>
         <w:drawing>
           <wp:inline distT="0" distB="0" distL="0" distR="0">
-            <wp:extent cx="5760085" cy="3476625"/>
+            <wp:extent cx="5760085" cy="3467735"/>
             <wp:effectExtent l="0" t="0" r="0" b="0"/>
             <wp:docPr id="7" name="Image7" descr=""/>
             <wp:cNvGraphicFramePr>
@@ -31630,7 +31744,7 @@
                   <pic:spPr bwMode="auto">
                     <a:xfrm>
                       <a:off x="0" y="0"/>
-                      <a:ext cx="5760085" cy="3476625"/>
+                      <a:ext cx="5760085" cy="3467735"/>
                     </a:xfrm>
                     <a:prstGeom prst="rect">
                       <a:avLst/>
@@ -31659,27 +31773,13 @@
         <w:pStyle w:val="Compact"/>
         <w:numPr>
           <w:ilvl w:val="0"/>
-          <w:numId w:val="110"/>
-        </w:numPr>
-        <w:rPr/>
-      </w:pPr>
-      <w:r>
-        <w:rPr/>
-        <w:t>Creazione, estensione e controllo conflitti condividono la semantica degli intervalli; il database impedisce sovrapposizioni anche in concorrenza.</w:t>
-      </w:r>
-    </w:p>
-    <w:p>
-      <w:pPr>
-        <w:pStyle w:val="Compact"/>
-        <w:numPr>
-          <w:ilvl w:val="0"/>
           <w:numId w:val="111"/>
         </w:numPr>
         <w:rPr/>
       </w:pPr>
       <w:r>
         <w:rPr/>
-        <w:t>Check-in e ownership non accettano richieste in coda come prenotazioni.</w:t>
+        <w:t>Creazione, estensione e controllo conflitti condividono la semantica degli intervalli; il database impedisce sovrapposizioni anche in concorrenza.</w:t>
       </w:r>
     </w:p>
     <w:p>
@@ -31693,7 +31793,7 @@
       </w:pPr>
       <w:r>
         <w:rPr/>
-        <w:t>Cancellazione del personale, no-show e scadenza convergono sulla stessa promozione, senza duplicarne l’algoritmo FIFO.</w:t>
+        <w:t>Check-in e ownership non accettano richieste in coda come prenotazioni.</w:t>
       </w:r>
     </w:p>
     <w:p>
@@ -31707,7 +31807,7 @@
       </w:pPr>
       <w:r>
         <w:rPr/>
-        <w:t>Cron e transizioni usano lock o guardie di stato per non duplicare promozioni, notifiche e log.</w:t>
+        <w:t>Cancellazione del personale, no-show e scadenza convergono sulla stessa promozione, senza duplicarne l’algoritmo FIFO.</w:t>
       </w:r>
     </w:p>
     <w:p>
@@ -31721,7 +31821,7 @@
       </w:pPr>
       <w:r>
         <w:rPr/>
-        <w:t>Le notifiche della coda sono persistenti e collegate alla prenotazione; il badge le rileva tramite polling senza mantenere connessioni SSE serverless.</w:t>
+        <w:t>Cron e transizioni usano lock o guardie di stato per non duplicare promozioni, notifiche e log.</w:t>
       </w:r>
     </w:p>
     <w:p>
@@ -31733,33 +31833,9 @@
         </w:numPr>
         <w:rPr/>
       </w:pPr>
-      <w:bookmarkStart w:id="117" w:name="ripple-effect-chiusi"/>
-      <w:r>
-        <w:rPr/>
-        <w:t>Le statistiche distinguono gli eventi della coda dai conteggi storici.</w:t>
-      </w:r>
-      <w:bookmarkEnd w:id="117"/>
-    </w:p>
-    <w:p>
-      <w:pPr>
-        <w:pStyle w:val="Heading3"/>
-        <w:rPr/>
-      </w:pPr>
-      <w:bookmarkStart w:id="118" w:name="evidenza-di-verifica"/>
-      <w:bookmarkEnd w:id="118"/>
-      <w:r>
-        <w:rPr/>
-        <w:t>Evidenza di verifica</w:t>
-      </w:r>
-    </w:p>
-    <w:p>
-      <w:pPr>
-        <w:pStyle w:val="FirstParagraph"/>
-        <w:rPr/>
-      </w:pPr>
-      <w:r>
-        <w:rPr/>
-        <w:t>La coerenza del TO-BE è supportata dai documenti di Fase 6:</w:t>
+      <w:r>
+        <w:rPr/>
+        <w:t>Le notifiche della coda sono persistenti e collegate alla prenotazione; il badge le rileva tramite polling senza mantenere connessioni SSE serverless.</w:t>
       </w:r>
     </w:p>
     <w:p>
@@ -31771,9 +31847,33 @@
         </w:numPr>
         <w:rPr/>
       </w:pPr>
-      <w:r>
-        <w:rPr/>
-        <w:t>specifica dei test post-modifica;</w:t>
+      <w:bookmarkStart w:id="117" w:name="ripple-effect-chiusi"/>
+      <w:r>
+        <w:rPr/>
+        <w:t>Le statistiche distinguono gli eventi della coda dai conteggi storici.</w:t>
+      </w:r>
+      <w:bookmarkEnd w:id="117"/>
+    </w:p>
+    <w:p>
+      <w:pPr>
+        <w:pStyle w:val="Heading3"/>
+        <w:rPr/>
+      </w:pPr>
+      <w:bookmarkStart w:id="118" w:name="evidenza-di-verifica"/>
+      <w:bookmarkEnd w:id="118"/>
+      <w:r>
+        <w:rPr/>
+        <w:t>Evidenza di verifica</w:t>
+      </w:r>
+    </w:p>
+    <w:p>
+      <w:pPr>
+        <w:pStyle w:val="FirstParagraph"/>
+        <w:rPr/>
+      </w:pPr>
+      <w:r>
+        <w:rPr/>
+        <w:t>La coerenza del TO-BE è supportata dai documenti di Fase 6:</w:t>
       </w:r>
     </w:p>
     <w:p>
@@ -31787,7 +31887,7 @@
       </w:pPr>
       <w:r>
         <w:rPr/>
-        <w:t>report delle parti modificate;</w:t>
+        <w:t>specifica dei test post-modifica;</w:t>
       </w:r>
     </w:p>
     <w:p>
@@ -31801,7 +31901,7 @@
       </w:pPr>
       <w:r>
         <w:rPr/>
-        <w:t>report di regressione;</w:t>
+        <w:t>report delle parti modificate;</w:t>
       </w:r>
     </w:p>
     <w:p>
@@ -31810,6 +31910,20 @@
         <w:numPr>
           <w:ilvl w:val="0"/>
           <w:numId w:val="119"/>
+        </w:numPr>
+        <w:rPr/>
+      </w:pPr>
+      <w:r>
+        <w:rPr/>
+        <w:t>report di regressione;</w:t>
+      </w:r>
+    </w:p>
+    <w:p>
+      <w:pPr>
+        <w:pStyle w:val="Compact"/>
+        <w:numPr>
+          <w:ilvl w:val="0"/>
+          <w:numId w:val="120"/>
         </w:numPr>
         <w:rPr/>
       </w:pPr>
@@ -31855,7 +31969,7 @@
         <w:spacing w:before="0" w:after="120"/>
         <w:rPr/>
       </w:pPr>
-      <w:bookmarkStart w:id="125" w:name="__RefHeading___Toc7616_3672760668"/>
+      <w:bookmarkStart w:id="125" w:name="__RefHeading___Toc7667_4122350189"/>
       <w:bookmarkEnd w:id="125"/>
       <w:r>
         <w:rPr/>
@@ -31867,7 +31981,7 @@
         <w:pStyle w:val="Heading2"/>
         <w:rPr/>
       </w:pPr>
-      <w:bookmarkStart w:id="126" w:name="__RefHeading___Toc7618_3672760668"/>
+      <w:bookmarkStart w:id="126" w:name="__RefHeading___Toc7669_4122350189"/>
       <w:bookmarkEnd w:id="126"/>
       <w:r>
         <w:rPr/>
@@ -35406,7 +35520,7 @@
         <w:pStyle w:val="Compact"/>
         <w:numPr>
           <w:ilvl w:val="0"/>
-          <w:numId w:val="120"/>
+          <w:numId w:val="121"/>
         </w:numPr>
         <w:rPr/>
       </w:pPr>
@@ -35419,40 +35533,6 @@
           <w:rStyle w:val="VerbatimChar"/>
         </w:rPr>
         <w:t>GET /api/admin/posti/[id]</w:t>
-      </w:r>
-      <w:r>
-        <w:rPr/>
-        <w:t>;</w:t>
-      </w:r>
-    </w:p>
-    <w:p>
-      <w:pPr>
-        <w:pStyle w:val="Compact"/>
-        <w:numPr>
-          <w:ilvl w:val="0"/>
-          <w:numId w:val="121"/>
-        </w:numPr>
-        <w:rPr/>
-      </w:pPr>
-      <w:r>
-        <w:rPr/>
-        <w:t xml:space="preserve">applicare autenticazione e ruolo staff a </w:t>
-      </w:r>
-      <w:r>
-        <w:rPr>
-          <w:rStyle w:val="VerbatimChar"/>
-        </w:rPr>
-        <w:t>GET</w:t>
-      </w:r>
-      <w:r>
-        <w:rPr/>
-        <w:t xml:space="preserve"> e </w:t>
-      </w:r>
-      <w:r>
-        <w:rPr>
-          <w:rStyle w:val="VerbatimChar"/>
-        </w:rPr>
-        <w:t>PATCH /api/admin/richieste</w:t>
       </w:r>
       <w:r>
         <w:rPr/>
@@ -35470,6 +35550,40 @@
       </w:pPr>
       <w:r>
         <w:rPr/>
+        <w:t xml:space="preserve">applicare autenticazione e ruolo staff a </w:t>
+      </w:r>
+      <w:r>
+        <w:rPr>
+          <w:rStyle w:val="VerbatimChar"/>
+        </w:rPr>
+        <w:t>GET</w:t>
+      </w:r>
+      <w:r>
+        <w:rPr/>
+        <w:t xml:space="preserve"> e </w:t>
+      </w:r>
+      <w:r>
+        <w:rPr>
+          <w:rStyle w:val="VerbatimChar"/>
+        </w:rPr>
+        <w:t>PATCH /api/admin/richieste</w:t>
+      </w:r>
+      <w:r>
+        <w:rPr/>
+        <w:t>;</w:t>
+      </w:r>
+    </w:p>
+    <w:p>
+      <w:pPr>
+        <w:pStyle w:val="Compact"/>
+        <w:numPr>
+          <w:ilvl w:val="0"/>
+          <w:numId w:val="123"/>
+        </w:numPr>
+        <w:rPr/>
+      </w:pPr>
+      <w:r>
+        <w:rPr/>
         <w:t xml:space="preserve">convertire </w:t>
       </w:r>
       <w:r>
@@ -35508,7 +35622,7 @@
         <w:pStyle w:val="Compact"/>
         <w:numPr>
           <w:ilvl w:val="0"/>
-          <w:numId w:val="123"/>
+          <w:numId w:val="124"/>
         </w:numPr>
         <w:rPr/>
       </w:pPr>
@@ -36639,144 +36753,13 @@
         <w:pStyle w:val="Compact"/>
         <w:numPr>
           <w:ilvl w:val="0"/>
-          <w:numId w:val="124"/>
-        </w:numPr>
-        <w:rPr/>
-      </w:pPr>
-      <w:r>
-        <w:rPr/>
-        <w:t>due richieste simultanee ripetute internamente su tre round;</w:t>
-      </w:r>
-    </w:p>
-    <w:p>
-      <w:pPr>
-        <w:pStyle w:val="Compact"/>
-        <w:numPr>
-          <w:ilvl w:val="0"/>
           <w:numId w:val="125"/>
         </w:numPr>
         <w:rPr/>
       </w:pPr>
       <w:r>
         <w:rPr/>
-        <w:t>N richieste simultanee con controllo dell’unico vincitore e assenza di record fantasma.</w:t>
-      </w:r>
-    </w:p>
-    <w:p>
-      <w:pPr>
-        <w:pStyle w:val="FirstParagraph"/>
-        <w:rPr/>
-      </w:pPr>
-      <w:r>
-        <w:rPr/>
-        <w:t>Esito aggregato:</w:t>
-      </w:r>
-    </w:p>
-    <w:p>
-      <w:pPr>
-        <w:pStyle w:val="SourceCode"/>
-        <w:rPr/>
-      </w:pPr>
-      <w:r>
-        <w:rPr>
-          <w:rStyle w:val="VerbatimChar"/>
-        </w:rPr>
-        <w:t>RUN 1..5: exit 0</w:t>
-      </w:r>
-      <w:r>
-        <w:rPr/>
-        <w:br/>
-      </w:r>
-      <w:r>
-        <w:rPr>
-          <w:rStyle w:val="VerbatimChar"/>
-        </w:rPr>
-        <w:t>Test Files  1 passed (1) per esecuzione</w:t>
-      </w:r>
-      <w:r>
-        <w:rPr/>
-        <w:br/>
-      </w:r>
-      <w:r>
-        <w:rPr>
-          <w:rStyle w:val="VerbatimChar"/>
-        </w:rPr>
-        <w:t>Tests       2 passed (2) per esecuzione</w:t>
-      </w:r>
-      <w:r>
-        <w:rPr/>
-        <w:br/>
-      </w:r>
-      <w:r>
-        <w:rPr>
-          <w:rStyle w:val="VerbatimChar"/>
-        </w:rPr>
-        <w:t>Totale      10/10 passati</w:t>
-      </w:r>
-    </w:p>
-    <w:p>
-      <w:pPr>
-        <w:pStyle w:val="FirstParagraph"/>
-        <w:rPr/>
-      </w:pPr>
-      <w:bookmarkStart w:id="134" w:name="ca-02-concorrenza-verificato"/>
-      <w:r>
-        <w:rPr/>
-        <w:t>I messaggi Prisma relativi a write conflict, deadlock o violazione del vincolo di esclusione sono attesi: rappresentano le richieste perdenti che il dominio traduce in conflitto, non fallimenti del test.</w:t>
-      </w:r>
-      <w:bookmarkEnd w:id="134"/>
-    </w:p>
-    <w:p>
-      <w:pPr>
-        <w:pStyle w:val="Heading3"/>
-        <w:rPr/>
-      </w:pPr>
-      <w:bookmarkStart w:id="135" w:name="ca-03-ca-04-e-ca-05-verificati"/>
-      <w:r>
-        <w:rPr/>
-        <w:t>CA-03, CA-04 e CA-05 — verificati</w:t>
-      </w:r>
-    </w:p>
-    <w:p>
-      <w:pPr>
-        <w:pStyle w:val="FirstParagraph"/>
-        <w:rPr/>
-      </w:pPr>
-      <w:r>
-        <w:rPr/>
-        <w:t>Una selezione di dieci file focalizzati su lista d’attesa, dominio, riassegnazione, automazioni, notifiche e realtime ha prodotto:</w:t>
-      </w:r>
-    </w:p>
-    <w:p>
-      <w:pPr>
-        <w:pStyle w:val="SourceCode"/>
-        <w:rPr/>
-      </w:pPr>
-      <w:r>
-        <w:rPr>
-          <w:rStyle w:val="VerbatimChar"/>
-        </w:rPr>
-        <w:t>Test Files  10 passed (10)</w:t>
-      </w:r>
-      <w:r>
-        <w:rPr/>
-        <w:br/>
-      </w:r>
-      <w:r>
-        <w:rPr>
-          <w:rStyle w:val="VerbatimChar"/>
-        </w:rPr>
-        <w:t>Tests       113 passed (113)</w:t>
-      </w:r>
-    </w:p>
-    <w:p>
-      <w:pPr>
-        <w:pStyle w:val="FirstParagraph"/>
-        <w:rPr/>
-      </w:pPr>
-      <w:r>
-        <w:rPr/>
-        <w:t>Le evidenze includono:</w:t>
+        <w:t>due richieste simultanee ripetute internamente su tre round;</w:t>
       </w:r>
     </w:p>
     <w:p>
@@ -36790,7 +36773,124 @@
       </w:pPr>
       <w:r>
         <w:rPr/>
-        <w:t>unicità DB della richiesta in coda e nessun duplicato;</w:t>
+        <w:t>N richieste simultanee con controllo dell’unico vincitore e assenza di record fantasma.</w:t>
+      </w:r>
+    </w:p>
+    <w:p>
+      <w:pPr>
+        <w:pStyle w:val="FirstParagraph"/>
+        <w:rPr/>
+      </w:pPr>
+      <w:r>
+        <w:rPr/>
+        <w:t>Esito aggregato:</w:t>
+      </w:r>
+    </w:p>
+    <w:p>
+      <w:pPr>
+        <w:pStyle w:val="SourceCode"/>
+        <w:rPr/>
+      </w:pPr>
+      <w:r>
+        <w:rPr>
+          <w:rStyle w:val="VerbatimChar"/>
+        </w:rPr>
+        <w:t>RUN 1..5: exit 0</w:t>
+      </w:r>
+      <w:r>
+        <w:rPr/>
+        <w:br/>
+      </w:r>
+      <w:r>
+        <w:rPr>
+          <w:rStyle w:val="VerbatimChar"/>
+        </w:rPr>
+        <w:t>Test Files  1 passed (1) per esecuzione</w:t>
+      </w:r>
+      <w:r>
+        <w:rPr/>
+        <w:br/>
+      </w:r>
+      <w:r>
+        <w:rPr>
+          <w:rStyle w:val="VerbatimChar"/>
+        </w:rPr>
+        <w:t>Tests       2 passed (2) per esecuzione</w:t>
+      </w:r>
+      <w:r>
+        <w:rPr/>
+        <w:br/>
+      </w:r>
+      <w:r>
+        <w:rPr>
+          <w:rStyle w:val="VerbatimChar"/>
+        </w:rPr>
+        <w:t>Totale      10/10 passati</w:t>
+      </w:r>
+    </w:p>
+    <w:p>
+      <w:pPr>
+        <w:pStyle w:val="FirstParagraph"/>
+        <w:rPr/>
+      </w:pPr>
+      <w:bookmarkStart w:id="134" w:name="ca-02-concorrenza-verificato"/>
+      <w:r>
+        <w:rPr/>
+        <w:t>I messaggi Prisma relativi a write conflict, deadlock o violazione del vincolo di esclusione sono attesi: rappresentano le richieste perdenti che il dominio traduce in conflitto, non fallimenti del test.</w:t>
+      </w:r>
+      <w:bookmarkEnd w:id="134"/>
+    </w:p>
+    <w:p>
+      <w:pPr>
+        <w:pStyle w:val="Heading3"/>
+        <w:rPr/>
+      </w:pPr>
+      <w:bookmarkStart w:id="135" w:name="ca-03-ca-04-e-ca-05-verificati"/>
+      <w:r>
+        <w:rPr/>
+        <w:t>CA-03, CA-04 e CA-05 — verificati</w:t>
+      </w:r>
+    </w:p>
+    <w:p>
+      <w:pPr>
+        <w:pStyle w:val="FirstParagraph"/>
+        <w:rPr/>
+      </w:pPr>
+      <w:r>
+        <w:rPr/>
+        <w:t>Una selezione di dieci file focalizzati su lista d’attesa, dominio, riassegnazione, automazioni, notifiche e realtime ha prodotto:</w:t>
+      </w:r>
+    </w:p>
+    <w:p>
+      <w:pPr>
+        <w:pStyle w:val="SourceCode"/>
+        <w:rPr/>
+      </w:pPr>
+      <w:r>
+        <w:rPr>
+          <w:rStyle w:val="VerbatimChar"/>
+        </w:rPr>
+        <w:t>Test Files  10 passed (10)</w:t>
+      </w:r>
+      <w:r>
+        <w:rPr/>
+        <w:br/>
+      </w:r>
+      <w:r>
+        <w:rPr>
+          <w:rStyle w:val="VerbatimChar"/>
+        </w:rPr>
+        <w:t>Tests       113 passed (113)</w:t>
+      </w:r>
+    </w:p>
+    <w:p>
+      <w:pPr>
+        <w:pStyle w:val="FirstParagraph"/>
+        <w:rPr/>
+      </w:pPr>
+      <w:r>
+        <w:rPr/>
+        <w:t>Le evidenze includono:</w:t>
       </w:r>
     </w:p>
     <w:p>
@@ -36804,27 +36904,7 @@
       </w:pPr>
       <w:r>
         <w:rPr/>
-        <w:t xml:space="preserve">ordinamento deterministico per </w:t>
-      </w:r>
-      <w:r>
-        <w:rPr>
-          <w:rStyle w:val="VerbatimChar"/>
-        </w:rPr>
-        <w:t>createdAt</w:t>
-      </w:r>
-      <w:r>
-        <w:rPr/>
-        <w:t xml:space="preserve"> con </w:t>
-      </w:r>
-      <w:r>
-        <w:rPr>
-          <w:rStyle w:val="VerbatimChar"/>
-        </w:rPr>
-        <w:t>id</w:t>
-      </w:r>
-      <w:r>
-        <w:rPr/>
-        <w:t xml:space="preserve"> come tie-breaker;</w:t>
+        <w:t>unicità DB della richiesta in coda e nessun duplicato;</w:t>
       </w:r>
     </w:p>
     <w:p>
@@ -36838,7 +36918,27 @@
       </w:pPr>
       <w:r>
         <w:rPr/>
-        <w:t>promozione transazionale senza sovrapposizioni;</w:t>
+        <w:t xml:space="preserve">ordinamento deterministico per </w:t>
+      </w:r>
+      <w:r>
+        <w:rPr>
+          <w:rStyle w:val="VerbatimChar"/>
+        </w:rPr>
+        <w:t>createdAt</w:t>
+      </w:r>
+      <w:r>
+        <w:rPr/>
+        <w:t xml:space="preserve"> con </w:t>
+      </w:r>
+      <w:r>
+        <w:rPr>
+          <w:rStyle w:val="VerbatimChar"/>
+        </w:rPr>
+        <w:t>id</w:t>
+      </w:r>
+      <w:r>
+        <w:rPr/>
+        <w:t xml:space="preserve"> come tie-breaker;</w:t>
       </w:r>
     </w:p>
     <w:p>
@@ -36852,7 +36952,7 @@
       </w:pPr>
       <w:r>
         <w:rPr/>
-        <w:t>idempotenza di lock cron, scadenza e promozione;</w:t>
+        <w:t>promozione transazionale senza sovrapposizioni;</w:t>
       </w:r>
     </w:p>
     <w:p>
@@ -36866,7 +36966,7 @@
       </w:pPr>
       <w:r>
         <w:rPr/>
-        <w:t>log correlati e notifiche per ingresso, uscita, promozione e scadenza;</w:t>
+        <w:t>idempotenza di lock cron, scadenza e promozione;</w:t>
       </w:r>
     </w:p>
     <w:p>
@@ -36878,6 +36978,20 @@
         </w:numPr>
         <w:rPr/>
       </w:pPr>
+      <w:r>
+        <w:rPr/>
+        <w:t>log correlati e notifiche per ingresso, uscita, promozione e scadenza;</w:t>
+      </w:r>
+    </w:p>
+    <w:p>
+      <w:pPr>
+        <w:pStyle w:val="Compact"/>
+        <w:numPr>
+          <w:ilvl w:val="0"/>
+          <w:numId w:val="132"/>
+        </w:numPr>
+        <w:rPr/>
+      </w:pPr>
       <w:bookmarkStart w:id="136" w:name="ca-03-ca-04-e-ca-05-verificati"/>
       <w:r>
         <w:rPr/>
@@ -36986,37 +37100,13 @@
         <w:pStyle w:val="Compact"/>
         <w:numPr>
           <w:ilvl w:val="0"/>
-          <w:numId w:val="132"/>
-        </w:numPr>
-        <w:rPr/>
-      </w:pPr>
-      <w:r>
-        <w:rPr/>
-        <w:t>10 riesecuzioni complete consecutive: tutte verdi;</w:t>
-      </w:r>
-    </w:p>
-    <w:p>
-      <w:pPr>
-        <w:pStyle w:val="Compact"/>
-        <w:numPr>
-          <w:ilvl w:val="0"/>
           <w:numId w:val="133"/>
         </w:numPr>
         <w:rPr/>
       </w:pPr>
       <w:r>
         <w:rPr/>
-        <w:t xml:space="preserve">ultima esecuzione dopo ricreazione del container, 7/7 migrazioni e fixture pulita: 179 passati, 2 </w:t>
-      </w:r>
-      <w:r>
-        <w:rPr>
-          <w:rStyle w:val="VerbatimChar"/>
-        </w:rPr>
-        <w:t>expected fail</w:t>
-      </w:r>
-      <w:r>
-        <w:rPr/>
-        <w:t>, 0 fallimenti inattesi;</w:t>
+        <w:t>10 riesecuzioni complete consecutive: tutte verdi;</w:t>
       </w:r>
     </w:p>
     <w:p>
@@ -37030,30 +37120,17 @@
       </w:pPr>
       <w:r>
         <w:rPr/>
-        <w:t>suite concorrenza isolata: 5/5 esecuzioni verdi.</w:t>
-      </w:r>
-    </w:p>
-    <w:p>
-      <w:pPr>
-        <w:pStyle w:val="FirstParagraph"/>
-        <w:rPr/>
-      </w:pPr>
-      <w:bookmarkStart w:id="139" w:name="stabilità-della-suite-completa"/>
-      <w:r>
-        <w:rPr/>
-        <w:t>Il dato è registrato per trasparenza come probabile contaminazione dello stato di test durante la sessione esplorativa. Non c’è al momento un fallimento riproducibile da aprire come regressione; se ricompare in CI va conservato il log completo e aperta una task di stabilizzazione del test database.</w:t>
-      </w:r>
-      <w:bookmarkEnd w:id="139"/>
-    </w:p>
-    <w:p>
-      <w:pPr>
-        <w:pStyle w:val="Heading3"/>
-        <w:rPr/>
-      </w:pPr>
-      <w:bookmarkStart w:id="140" w:name="stato-consigliato"/>
-      <w:r>
-        <w:rPr/>
-        <w:t>Stato consigliato</w:t>
+        <w:t xml:space="preserve">ultima esecuzione dopo ricreazione del container, 7/7 migrazioni e fixture pulita: 179 passati, 2 </w:t>
+      </w:r>
+      <w:r>
+        <w:rPr>
+          <w:rStyle w:val="VerbatimChar"/>
+        </w:rPr>
+        <w:t>expected fail</w:t>
+      </w:r>
+      <w:r>
+        <w:rPr/>
+        <w:t>, 0 fallimenti inattesi;</w:t>
       </w:r>
     </w:p>
     <w:p>
@@ -37067,6 +37144,43 @@
       </w:pPr>
       <w:r>
         <w:rPr/>
+        <w:t>suite concorrenza isolata: 5/5 esecuzioni verdi.</w:t>
+      </w:r>
+    </w:p>
+    <w:p>
+      <w:pPr>
+        <w:pStyle w:val="FirstParagraph"/>
+        <w:rPr/>
+      </w:pPr>
+      <w:bookmarkStart w:id="139" w:name="stabilità-della-suite-completa"/>
+      <w:r>
+        <w:rPr/>
+        <w:t>Il dato è registrato per trasparenza come probabile contaminazione dello stato di test durante la sessione esplorativa. Non c’è al momento un fallimento riproducibile da aprire come regressione; se ricompare in CI va conservato il log completo e aperta una task di stabilizzazione del test database.</w:t>
+      </w:r>
+      <w:bookmarkEnd w:id="139"/>
+    </w:p>
+    <w:p>
+      <w:pPr>
+        <w:pStyle w:val="Heading3"/>
+        <w:rPr/>
+      </w:pPr>
+      <w:bookmarkStart w:id="140" w:name="stato-consigliato"/>
+      <w:r>
+        <w:rPr/>
+        <w:t>Stato consigliato</w:t>
+      </w:r>
+    </w:p>
+    <w:p>
+      <w:pPr>
+        <w:pStyle w:val="Compact"/>
+        <w:numPr>
+          <w:ilvl w:val="0"/>
+          <w:numId w:val="136"/>
+        </w:numPr>
+        <w:rPr/>
+      </w:pPr>
+      <w:r>
+        <w:rPr/>
         <w:t xml:space="preserve">BIB-63: </w:t>
       </w:r>
       <w:r>
@@ -37086,27 +37200,13 @@
         <w:pStyle w:val="Compact"/>
         <w:numPr>
           <w:ilvl w:val="0"/>
-          <w:numId w:val="136"/>
-        </w:numPr>
-        <w:rPr/>
-      </w:pPr>
-      <w:r>
-        <w:rPr/>
-        <w:t>BIB-68: correzione implementata e verificata (401/403/422 su tutte e tre le route, 36/36 test focalizzati, 187/187 sulla suite completa); in revisione.</w:t>
-      </w:r>
-    </w:p>
-    <w:p>
-      <w:pPr>
-        <w:pStyle w:val="Compact"/>
-        <w:numPr>
-          <w:ilvl w:val="0"/>
           <w:numId w:val="137"/>
         </w:numPr>
         <w:rPr/>
       </w:pPr>
       <w:r>
         <w:rPr/>
-        <w:t>BIB-7 (epic Fase 6): chiudibile dopo il merge della PR di BIB-68.</w:t>
+        <w:t>BIB-68: correzione implementata e verificata (401/403/422 su tutte e tre le route, 36/36 test focalizzati, 187/187 sulla suite completa); in revisione.</w:t>
       </w:r>
     </w:p>
     <w:p>
@@ -37115,6 +37215,20 @@
         <w:numPr>
           <w:ilvl w:val="0"/>
           <w:numId w:val="138"/>
+        </w:numPr>
+        <w:rPr/>
+      </w:pPr>
+      <w:r>
+        <w:rPr/>
+        <w:t>BIB-7 (epic Fase 6): chiudibile dopo il merge della PR di BIB-68.</w:t>
+      </w:r>
+    </w:p>
+    <w:p>
+      <w:pPr>
+        <w:pStyle w:val="Compact"/>
+        <w:numPr>
+          <w:ilvl w:val="0"/>
+          <w:numId w:val="139"/>
         </w:numPr>
         <w:rPr/>
       </w:pPr>
@@ -41480,7 +41594,7 @@
     <w:abstractNumId w:val="1"/>
   </w:num>
   <w:num w:numId="66">
-    <w:abstractNumId w:val="3"/>
+    <w:abstractNumId w:val="1"/>
   </w:num>
   <w:num w:numId="67">
     <w:abstractNumId w:val="3"/>
@@ -41513,13 +41627,13 @@
     <w:abstractNumId w:val="3"/>
   </w:num>
   <w:num w:numId="77">
+    <w:abstractNumId w:val="3"/>
+  </w:num>
+  <w:num w:numId="78">
     <w:abstractNumId w:val="1"/>
     <w:lvlOverride w:ilvl="0">
       <w:startOverride w:val="1"/>
     </w:lvlOverride>
-  </w:num>
-  <w:num w:numId="78">
-    <w:abstractNumId w:val="1"/>
   </w:num>
   <w:num w:numId="79">
     <w:abstractNumId w:val="1"/>
@@ -41529,12 +41643,12 @@
   </w:num>
   <w:num w:numId="81">
     <w:abstractNumId w:val="1"/>
+  </w:num>
+  <w:num w:numId="82">
+    <w:abstractNumId w:val="1"/>
     <w:lvlOverride w:ilvl="0">
       <w:startOverride w:val="1"/>
     </w:lvlOverride>
-  </w:num>
-  <w:num w:numId="82">
-    <w:abstractNumId w:val="1"/>
   </w:num>
   <w:num w:numId="83">
     <w:abstractNumId w:val="1"/>
@@ -41552,7 +41666,7 @@
     <w:abstractNumId w:val="1"/>
   </w:num>
   <w:num w:numId="88">
-    <w:abstractNumId w:val="3"/>
+    <w:abstractNumId w:val="1"/>
   </w:num>
   <w:num w:numId="89">
     <w:abstractNumId w:val="3"/>
@@ -41567,16 +41681,16 @@
     <w:abstractNumId w:val="3"/>
   </w:num>
   <w:num w:numId="93">
+    <w:abstractNumId w:val="3"/>
+  </w:num>
+  <w:num w:numId="94">
     <w:abstractNumId w:val="1"/>
     <w:lvlOverride w:ilvl="0">
       <w:startOverride w:val="1"/>
     </w:lvlOverride>
   </w:num>
-  <w:num w:numId="94">
+  <w:num w:numId="95">
     <w:abstractNumId w:val="1"/>
-  </w:num>
-  <w:num w:numId="95">
-    <w:abstractNumId w:val="3"/>
   </w:num>
   <w:num w:numId="96">
     <w:abstractNumId w:val="3"/>
@@ -41597,13 +41711,13 @@
     <w:abstractNumId w:val="3"/>
   </w:num>
   <w:num w:numId="102">
+    <w:abstractNumId w:val="3"/>
+  </w:num>
+  <w:num w:numId="103">
     <w:abstractNumId w:val="1"/>
     <w:lvlOverride w:ilvl="0">
       <w:startOverride w:val="1"/>
     </w:lvlOverride>
-  </w:num>
-  <w:num w:numId="103">
-    <w:abstractNumId w:val="1"/>
   </w:num>
   <w:num w:numId="104">
     <w:abstractNumId w:val="1"/>
@@ -41615,7 +41729,7 @@
     <w:abstractNumId w:val="1"/>
   </w:num>
   <w:num w:numId="107">
-    <w:abstractNumId w:val="3"/>
+    <w:abstractNumId w:val="1"/>
   </w:num>
   <w:num w:numId="108">
     <w:abstractNumId w:val="3"/>
@@ -41624,13 +41738,13 @@
     <w:abstractNumId w:val="3"/>
   </w:num>
   <w:num w:numId="110">
+    <w:abstractNumId w:val="3"/>
+  </w:num>
+  <w:num w:numId="111">
     <w:abstractNumId w:val="1"/>
     <w:lvlOverride w:ilvl="0">
       <w:startOverride w:val="1"/>
     </w:lvlOverride>
-  </w:num>
-  <w:num w:numId="111">
-    <w:abstractNumId w:val="1"/>
   </w:num>
   <w:num w:numId="112">
     <w:abstractNumId w:val="1"/>
@@ -41645,7 +41759,7 @@
     <w:abstractNumId w:val="1"/>
   </w:num>
   <w:num w:numId="116">
-    <w:abstractNumId w:val="3"/>
+    <w:abstractNumId w:val="1"/>
   </w:num>
   <w:num w:numId="117">
     <w:abstractNumId w:val="3"/>
@@ -41657,13 +41771,13 @@
     <w:abstractNumId w:val="3"/>
   </w:num>
   <w:num w:numId="120">
+    <w:abstractNumId w:val="3"/>
+  </w:num>
+  <w:num w:numId="121">
     <w:abstractNumId w:val="1"/>
     <w:lvlOverride w:ilvl="0">
       <w:startOverride w:val="1"/>
     </w:lvlOverride>
-  </w:num>
-  <w:num w:numId="121">
-    <w:abstractNumId w:val="1"/>
   </w:num>
   <w:num w:numId="122">
     <w:abstractNumId w:val="1"/>
@@ -41672,7 +41786,7 @@
     <w:abstractNumId w:val="1"/>
   </w:num>
   <w:num w:numId="124">
-    <w:abstractNumId w:val="3"/>
+    <w:abstractNumId w:val="1"/>
   </w:num>
   <w:num w:numId="125">
     <w:abstractNumId w:val="3"/>
@@ -41714,6 +41828,9 @@
     <w:abstractNumId w:val="3"/>
   </w:num>
   <w:num w:numId="138">
+    <w:abstractNumId w:val="3"/>
+  </w:num>
+  <w:num w:numId="139">
     <w:abstractNumId w:val="3"/>
   </w:num>
 </w:numbering>

</xml_diff>